<commit_message>
updated templates (to use placeholders)
</commit_message>
<xml_diff>
--- a/agreements/2. House Rules.docx
+++ b/agreements/2. House Rules.docx
@@ -504,7 +504,16 @@
           <w:color w:val="231F20"/>
           <w:sz w:val="20"/>
         </w:rPr>
-        <w:t>to be</w:t>
+        <w:t xml:space="preserve">to </w:t>
+      </w:r>
+      <w:proofErr w:type="gramStart"/>
+      <w:r>
+        <w:rPr>
+          <w:rFonts w:ascii="Cambria" w:eastAsia="Cambria" w:hAnsi="Cambria" w:cs="Cambria"/>
+          <w:color w:val="231F20"/>
+          <w:sz w:val="20"/>
+        </w:rPr>
+        <w:t>be</w:t>
       </w:r>
       <w:r>
         <w:rPr>
@@ -607,7 +616,17 @@
           <w:spacing w:val="-2"/>
           <w:sz w:val="20"/>
         </w:rPr>
-        <w:t>times.</w:t>
+        <w:t>times</w:t>
+      </w:r>
+      <w:proofErr w:type="gramEnd"/>
+      <w:r>
+        <w:rPr>
+          <w:rFonts w:ascii="Cambria" w:eastAsia="Cambria" w:hAnsi="Cambria" w:cs="Cambria"/>
+          <w:color w:val="231F20"/>
+          <w:spacing w:val="-2"/>
+          <w:sz w:val="20"/>
+        </w:rPr>
+        <w:t>.</w:t>
       </w:r>
     </w:p>
     <w:p>
@@ -763,6 +782,7 @@
         </w:rPr>
         <w:t xml:space="preserve"> </w:t>
       </w:r>
+      <w:proofErr w:type="gramStart"/>
       <w:r>
         <w:rPr>
           <w:rFonts w:ascii="Cambria" w:eastAsia="Cambria" w:hAnsi="Cambria" w:cs="Cambria"/>
@@ -771,6 +791,7 @@
         </w:rPr>
         <w:t>doors,</w:t>
       </w:r>
+      <w:proofErr w:type="gramEnd"/>
       <w:r>
         <w:rPr>
           <w:rFonts w:ascii="Cambria" w:eastAsia="Cambria" w:hAnsi="Cambria" w:cs="Cambria"/>
@@ -1245,6 +1266,7 @@
         </w:rPr>
         <w:t xml:space="preserve"> </w:t>
       </w:r>
+      <w:proofErr w:type="gramStart"/>
       <w:r>
         <w:rPr>
           <w:rFonts w:ascii="Cambria" w:eastAsia="Cambria" w:hAnsi="Cambria" w:cs="Cambria"/>
@@ -1252,7 +1274,17 @@
           <w:spacing w:val="-2"/>
           <w:sz w:val="20"/>
         </w:rPr>
-        <w:t>premise.</w:t>
+        <w:t>premise</w:t>
+      </w:r>
+      <w:proofErr w:type="gramEnd"/>
+      <w:r>
+        <w:rPr>
+          <w:rFonts w:ascii="Cambria" w:eastAsia="Cambria" w:hAnsi="Cambria" w:cs="Cambria"/>
+          <w:color w:val="231F20"/>
+          <w:spacing w:val="-2"/>
+          <w:sz w:val="20"/>
+        </w:rPr>
+        <w:t>.</w:t>
       </w:r>
     </w:p>
     <w:p>
@@ -2151,6 +2183,7 @@
         </w:rPr>
         <w:t xml:space="preserve"> </w:t>
       </w:r>
+      <w:proofErr w:type="gramStart"/>
       <w:r>
         <w:rPr>
           <w:rFonts w:ascii="Cambria" w:eastAsia="Cambria" w:hAnsi="Cambria" w:cs="Cambria"/>
@@ -2159,6 +2192,7 @@
         </w:rPr>
         <w:t>in</w:t>
       </w:r>
+      <w:proofErr w:type="gramEnd"/>
       <w:r>
         <w:rPr>
           <w:rFonts w:ascii="Cambria" w:eastAsia="Cambria" w:hAnsi="Cambria" w:cs="Cambria"/>
@@ -2185,6 +2219,7 @@
         </w:rPr>
         <w:t xml:space="preserve"> </w:t>
       </w:r>
+      <w:proofErr w:type="gramStart"/>
       <w:r>
         <w:rPr>
           <w:rFonts w:ascii="Cambria" w:eastAsia="Cambria" w:hAnsi="Cambria" w:cs="Cambria"/>
@@ -2192,7 +2227,17 @@
           <w:spacing w:val="-2"/>
           <w:sz w:val="20"/>
         </w:rPr>
-        <w:t>premise.</w:t>
+        <w:t>premise</w:t>
+      </w:r>
+      <w:proofErr w:type="gramEnd"/>
+      <w:r>
+        <w:rPr>
+          <w:rFonts w:ascii="Cambria" w:eastAsia="Cambria" w:hAnsi="Cambria" w:cs="Cambria"/>
+          <w:color w:val="231F20"/>
+          <w:spacing w:val="-2"/>
+          <w:sz w:val="20"/>
+        </w:rPr>
+        <w:t>.</w:t>
       </w:r>
     </w:p>
     <w:p>
@@ -2247,6 +2292,7 @@
         </w:rPr>
         <w:t xml:space="preserve"> </w:t>
       </w:r>
+      <w:proofErr w:type="gramStart"/>
       <w:r>
         <w:rPr>
           <w:rFonts w:ascii="Cambria" w:eastAsia="Cambria" w:hAnsi="Cambria" w:cs="Cambria"/>
@@ -2255,6 +2301,7 @@
         </w:rPr>
         <w:t>shall</w:t>
       </w:r>
+      <w:proofErr w:type="gramEnd"/>
       <w:r>
         <w:rPr>
           <w:rFonts w:ascii="Cambria" w:eastAsia="Cambria" w:hAnsi="Cambria" w:cs="Cambria"/>
@@ -2281,6 +2328,7 @@
         </w:rPr>
         <w:t xml:space="preserve"> </w:t>
       </w:r>
+      <w:proofErr w:type="gramStart"/>
       <w:r>
         <w:rPr>
           <w:rFonts w:ascii="Cambria" w:eastAsia="Cambria" w:hAnsi="Cambria" w:cs="Cambria"/>
@@ -2289,6 +2337,7 @@
         </w:rPr>
         <w:t>at</w:t>
       </w:r>
+      <w:proofErr w:type="gramEnd"/>
       <w:r>
         <w:rPr>
           <w:rFonts w:ascii="Cambria" w:eastAsia="Cambria" w:hAnsi="Cambria" w:cs="Cambria"/>
@@ -2383,6 +2432,7 @@
         </w:rPr>
         <w:t xml:space="preserve"> </w:t>
       </w:r>
+      <w:proofErr w:type="gramStart"/>
       <w:r>
         <w:rPr>
           <w:rFonts w:ascii="Cambria" w:eastAsia="Cambria" w:hAnsi="Cambria" w:cs="Cambria"/>
@@ -2391,6 +2441,7 @@
         </w:rPr>
         <w:t>and</w:t>
       </w:r>
+      <w:proofErr w:type="gramEnd"/>
       <w:r>
         <w:rPr>
           <w:rFonts w:ascii="Cambria" w:eastAsia="Cambria" w:hAnsi="Cambria" w:cs="Cambria"/>
@@ -2468,13 +2519,23 @@
         </w:rPr>
         <w:t xml:space="preserve"> </w:t>
       </w:r>
-      <w:r>
-        <w:rPr>
-          <w:rFonts w:ascii="Cambria" w:eastAsia="Cambria" w:hAnsi="Cambria" w:cs="Cambria"/>
-          <w:color w:val="231F20"/>
-          <w:sz w:val="20"/>
-        </w:rPr>
-        <w:t>weekend.</w:t>
+      <w:proofErr w:type="gramStart"/>
+      <w:r>
+        <w:rPr>
+          <w:rFonts w:ascii="Cambria" w:eastAsia="Cambria" w:hAnsi="Cambria" w:cs="Cambria"/>
+          <w:color w:val="231F20"/>
+          <w:sz w:val="20"/>
+        </w:rPr>
+        <w:t>weekend</w:t>
+      </w:r>
+      <w:proofErr w:type="gramEnd"/>
+      <w:r>
+        <w:rPr>
+          <w:rFonts w:ascii="Cambria" w:eastAsia="Cambria" w:hAnsi="Cambria" w:cs="Cambria"/>
+          <w:color w:val="231F20"/>
+          <w:sz w:val="20"/>
+        </w:rPr>
+        <w:t>.</w:t>
       </w:r>
       <w:r>
         <w:rPr>
@@ -2997,6 +3058,7 @@
         </w:rPr>
         <w:t xml:space="preserve"> </w:t>
       </w:r>
+      <w:proofErr w:type="gramStart"/>
       <w:r>
         <w:rPr>
           <w:rFonts w:ascii="Cambria" w:eastAsia="Cambria" w:hAnsi="Cambria" w:cs="Cambria"/>
@@ -3005,6 +3067,7 @@
         </w:rPr>
         <w:t>bring</w:t>
       </w:r>
+      <w:proofErr w:type="gramEnd"/>
       <w:r>
         <w:rPr>
           <w:rFonts w:ascii="Cambria" w:eastAsia="Cambria" w:hAnsi="Cambria" w:cs="Cambria"/>
@@ -3116,13 +3179,23 @@
         </w:rPr>
         <w:t xml:space="preserve"> </w:t>
       </w:r>
-      <w:r>
-        <w:rPr>
-          <w:rFonts w:ascii="Cambria" w:eastAsia="Cambria" w:hAnsi="Cambria" w:cs="Cambria"/>
-          <w:color w:val="231F20"/>
-          <w:sz w:val="20"/>
-        </w:rPr>
-        <w:t>reptile,</w:t>
+      <w:proofErr w:type="gramStart"/>
+      <w:r>
+        <w:rPr>
+          <w:rFonts w:ascii="Cambria" w:eastAsia="Cambria" w:hAnsi="Cambria" w:cs="Cambria"/>
+          <w:color w:val="231F20"/>
+          <w:sz w:val="20"/>
+        </w:rPr>
+        <w:t>reptile</w:t>
+      </w:r>
+      <w:proofErr w:type="gramEnd"/>
+      <w:r>
+        <w:rPr>
+          <w:rFonts w:ascii="Cambria" w:eastAsia="Cambria" w:hAnsi="Cambria" w:cs="Cambria"/>
+          <w:color w:val="231F20"/>
+          <w:sz w:val="20"/>
+        </w:rPr>
+        <w:t>,</w:t>
       </w:r>
       <w:r>
         <w:rPr>
@@ -3133,13 +3206,23 @@
         </w:rPr>
         <w:t xml:space="preserve"> </w:t>
       </w:r>
-      <w:r>
-        <w:rPr>
-          <w:rFonts w:ascii="Cambria" w:eastAsia="Cambria" w:hAnsi="Cambria" w:cs="Cambria"/>
-          <w:color w:val="231F20"/>
-          <w:sz w:val="20"/>
-        </w:rPr>
-        <w:t>bird,</w:t>
+      <w:proofErr w:type="gramStart"/>
+      <w:r>
+        <w:rPr>
+          <w:rFonts w:ascii="Cambria" w:eastAsia="Cambria" w:hAnsi="Cambria" w:cs="Cambria"/>
+          <w:color w:val="231F20"/>
+          <w:sz w:val="20"/>
+        </w:rPr>
+        <w:t>bird</w:t>
+      </w:r>
+      <w:proofErr w:type="gramEnd"/>
+      <w:r>
+        <w:rPr>
+          <w:rFonts w:ascii="Cambria" w:eastAsia="Cambria" w:hAnsi="Cambria" w:cs="Cambria"/>
+          <w:color w:val="231F20"/>
+          <w:sz w:val="20"/>
+        </w:rPr>
+        <w:t>,</w:t>
       </w:r>
       <w:r>
         <w:rPr>
@@ -3150,6 +3233,7 @@
         </w:rPr>
         <w:t xml:space="preserve"> </w:t>
       </w:r>
+      <w:proofErr w:type="gramStart"/>
       <w:r>
         <w:rPr>
           <w:rFonts w:ascii="Cambria" w:eastAsia="Cambria" w:hAnsi="Cambria" w:cs="Cambria"/>
@@ -3158,6 +3242,7 @@
         </w:rPr>
         <w:t>arachnid</w:t>
       </w:r>
+      <w:proofErr w:type="gramEnd"/>
       <w:r>
         <w:rPr>
           <w:rFonts w:ascii="Cambria" w:eastAsia="Cambria" w:hAnsi="Cambria" w:cs="Cambria"/>
@@ -3726,13 +3811,23 @@
           <w:color w:val="231F20"/>
           <w:sz w:val="20"/>
         </w:rPr>
-        <w:t>Cheryl Pua</w:t>
-      </w:r>
+        <w:t xml:space="preserve">Cheryl </w:t>
+      </w:r>
+      <w:proofErr w:type="gramStart"/>
       <w:r>
         <w:rPr>
           <w:rFonts w:ascii="Cambria" w:eastAsia="Cambria" w:hAnsi="Cambria" w:cs="Cambria"/>
           <w:b/>
           <w:color w:val="231F20"/>
+          <w:sz w:val="20"/>
+        </w:rPr>
+        <w:t>Pua</w:t>
+      </w:r>
+      <w:r>
+        <w:rPr>
+          <w:rFonts w:ascii="Cambria" w:eastAsia="Cambria" w:hAnsi="Cambria" w:cs="Cambria"/>
+          <w:b/>
+          <w:color w:val="231F20"/>
           <w:spacing w:val="-2"/>
           <w:sz w:val="20"/>
         </w:rPr>
@@ -3745,8 +3840,19 @@
           <w:color w:val="231F20"/>
           <w:sz w:val="20"/>
         </w:rPr>
-        <w:t xml:space="preserve">@0167015008 </w:t>
-      </w:r>
+        <w:t>@</w:t>
+      </w:r>
+      <w:proofErr w:type="gramEnd"/>
+      <w:r>
+        <w:rPr>
+          <w:rFonts w:ascii="Cambria" w:eastAsia="Cambria" w:hAnsi="Cambria" w:cs="Cambria"/>
+          <w:b/>
+          <w:color w:val="231F20"/>
+          <w:sz w:val="20"/>
+        </w:rPr>
+        <w:t xml:space="preserve">0167015008 </w:t>
+      </w:r>
+      <w:proofErr w:type="gramStart"/>
       <w:r>
         <w:rPr>
           <w:rFonts w:ascii="Cambria" w:eastAsia="Cambria" w:hAnsi="Cambria" w:cs="Cambria"/>
@@ -3772,7 +3878,18 @@
           <w:spacing w:val="-2"/>
           <w:sz w:val="20"/>
         </w:rPr>
-        <w:t>Vivian @0199496075.</w:t>
+        <w:t>Vivian</w:t>
+      </w:r>
+      <w:proofErr w:type="gramEnd"/>
+      <w:r>
+        <w:rPr>
+          <w:rFonts w:ascii="Cambria" w:eastAsia="Cambria" w:hAnsi="Cambria" w:cs="Cambria"/>
+          <w:b/>
+          <w:color w:val="231F20"/>
+          <w:spacing w:val="-2"/>
+          <w:sz w:val="20"/>
+        </w:rPr>
+        <w:t xml:space="preserve"> @0199496075.</w:t>
       </w:r>
     </w:p>
     <w:p>
@@ -3802,6 +3919,67 @@
       </w:pPr>
       <w:r>
         <w:rPr>
+          <w:noProof/>
+        </w:rPr>
+        <w:drawing>
+          <wp:anchor distT="0" distB="0" distL="114300" distR="114300" simplePos="0" relativeHeight="251657216" behindDoc="1" locked="0" layoutInCell="1" allowOverlap="1" wp14:anchorId="0C14A174" wp14:editId="7235382B">
+            <wp:simplePos x="0" y="0"/>
+            <wp:positionH relativeFrom="column">
+              <wp:posOffset>3891643</wp:posOffset>
+            </wp:positionH>
+            <wp:positionV relativeFrom="page">
+              <wp:posOffset>9051471</wp:posOffset>
+            </wp:positionV>
+            <wp:extent cx="1303020" cy="730250"/>
+            <wp:effectExtent l="0" t="0" r="0" b="0"/>
+            <wp:wrapNone/>
+            <wp:docPr id="263861726" name="Picture 1"/>
+            <wp:cNvGraphicFramePr>
+              <a:graphicFrameLocks xmlns:a="http://schemas.openxmlformats.org/drawingml/2006/main" noChangeAspect="1"/>
+            </wp:cNvGraphicFramePr>
+            <a:graphic xmlns:a="http://schemas.openxmlformats.org/drawingml/2006/main">
+              <a:graphicData uri="http://schemas.openxmlformats.org/drawingml/2006/picture">
+                <pic:pic xmlns:pic="http://schemas.openxmlformats.org/drawingml/2006/picture">
+                  <pic:nvPicPr>
+                    <pic:cNvPr id="263861726" name="Picture 1"/>
+                    <pic:cNvPicPr>
+                      <a:picLocks noChangeAspect="1"/>
+                    </pic:cNvPicPr>
+                  </pic:nvPicPr>
+                  <pic:blipFill>
+                    <a:blip r:embed="rId7" cstate="print">
+                      <a:extLst>
+                        <a:ext uri="{28A0092B-C50C-407E-A947-70E740481C1C}">
+                          <a14:useLocalDpi xmlns:a14="http://schemas.microsoft.com/office/drawing/2010/main" val="0"/>
+                        </a:ext>
+                      </a:extLst>
+                    </a:blip>
+                    <a:srcRect/>
+                    <a:stretch>
+                      <a:fillRect/>
+                    </a:stretch>
+                  </pic:blipFill>
+                  <pic:spPr bwMode="auto">
+                    <a:xfrm>
+                      <a:off x="0" y="0"/>
+                      <a:ext cx="1303020" cy="730250"/>
+                    </a:xfrm>
+                    <a:prstGeom prst="rect">
+                      <a:avLst/>
+                    </a:prstGeom>
+                    <a:noFill/>
+                    <a:ln>
+                      <a:noFill/>
+                    </a:ln>
+                  </pic:spPr>
+                </pic:pic>
+              </a:graphicData>
+            </a:graphic>
+          </wp:anchor>
+        </w:drawing>
+      </w:r>
+      <w:r>
+        <w:rPr>
           <w:rFonts w:ascii="Cambria" w:eastAsia="Cambria" w:hAnsi="Cambria" w:cs="Cambria"/>
           <w:color w:val="231F20"/>
           <w:sz w:val="20"/>
@@ -4200,6 +4378,12 @@
           <w:sz w:val="20"/>
         </w:rPr>
         <w:t>will launch police report for any suspicious illegal activity found.</w:t>
+      </w:r>
+      <w:r>
+        <w:rPr>
+          <w:noProof/>
+        </w:rPr>
+        <w:t xml:space="preserve"> </w:t>
       </w:r>
     </w:p>
     <w:p>
@@ -4377,6 +4561,7 @@
         </w:rPr>
         <w:t xml:space="preserve"> </w:t>
       </w:r>
+      <w:proofErr w:type="gramStart"/>
       <w:r>
         <w:rPr>
           <w:rFonts w:ascii="Cambria" w:eastAsia="Cambria" w:hAnsi="Cambria" w:cs="Cambria"/>
@@ -4384,7 +4569,17 @@
           <w:spacing w:val="-2"/>
           <w:sz w:val="20"/>
         </w:rPr>
-        <w:t>premise,</w:t>
+        <w:t>premise</w:t>
+      </w:r>
+      <w:proofErr w:type="gramEnd"/>
+      <w:r>
+        <w:rPr>
+          <w:rFonts w:ascii="Cambria" w:eastAsia="Cambria" w:hAnsi="Cambria" w:cs="Cambria"/>
+          <w:color w:val="231F20"/>
+          <w:spacing w:val="-2"/>
+          <w:sz w:val="20"/>
+        </w:rPr>
+        <w:t>,</w:t>
       </w:r>
     </w:p>
     <w:p>
@@ -4453,6 +4648,8 @@
           <w:szCs w:val="20"/>
         </w:rPr>
       </w:pPr>
+      <w:bookmarkStart w:id="0" w:name="NNF_1_8352_251_20_0_B"/>
+      <w:proofErr w:type="gramStart"/>
       <w:r>
         <w:rPr>
           <w:rFonts w:ascii="Cambria" w:eastAsia="Cambria" w:hAnsi="Cambria" w:cs="Cambria"/>
@@ -4482,6 +4679,7 @@
         </w:rPr>
         <w:t>:</w:t>
       </w:r>
+      <w:proofErr w:type="gramEnd"/>
       <w:r>
         <w:rPr>
           <w:rFonts w:ascii="Cambria" w:eastAsia="Cambria" w:hAnsi="Cambria" w:cs="Cambria"/>
@@ -4500,18 +4698,9 @@
           <w:sz w:val="20"/>
           <w:szCs w:val="20"/>
         </w:rPr>
-        <w:t>DI CHIA SENG</w:t>
-      </w:r>
-      <w:r>
-        <w:rPr>
-          <w:rFonts w:ascii="Cambria" w:eastAsia="Cambria" w:hAnsi="Cambria" w:cs="Cambria"/>
-          <w:b/>
-          <w:spacing w:val="-10"/>
-          <w:sz w:val="20"/>
-          <w:szCs w:val="20"/>
-        </w:rPr>
-        <w:t xml:space="preserve"> </w:t>
-      </w:r>
+        <w:t xml:space="preserve">{{tenant_name}} </w:t>
+      </w:r>
+      <w:bookmarkEnd w:id="0"/>
     </w:p>
     <w:p>
       <w:pPr>
@@ -4523,6 +4712,69 @@
           <w:sz w:val="20"/>
         </w:rPr>
       </w:pPr>
+      <w:bookmarkStart w:id="1" w:name="NNF_2_8352_251_20_0_B"/>
+      <w:r>
+        <w:rPr>
+          <w:noProof/>
+        </w:rPr>
+        <w:drawing>
+          <wp:anchor distT="0" distB="0" distL="114300" distR="114300" simplePos="0" relativeHeight="251662336" behindDoc="1" locked="0" layoutInCell="1" allowOverlap="1" wp14:anchorId="06204A7B" wp14:editId="15BF1520">
+            <wp:simplePos x="0" y="0"/>
+            <wp:positionH relativeFrom="column">
+              <wp:posOffset>4185557</wp:posOffset>
+            </wp:positionH>
+            <wp:positionV relativeFrom="page">
+              <wp:posOffset>8371114</wp:posOffset>
+            </wp:positionV>
+            <wp:extent cx="1303020" cy="730250"/>
+            <wp:effectExtent l="0" t="0" r="0" b="0"/>
+            <wp:wrapNone/>
+            <wp:docPr id="891031437" name="Picture 1"/>
+            <wp:cNvGraphicFramePr>
+              <a:graphicFrameLocks xmlns:a="http://schemas.openxmlformats.org/drawingml/2006/main" noChangeAspect="1"/>
+            </wp:cNvGraphicFramePr>
+            <a:graphic xmlns:a="http://schemas.openxmlformats.org/drawingml/2006/main">
+              <a:graphicData uri="http://schemas.openxmlformats.org/drawingml/2006/picture">
+                <pic:pic xmlns:pic="http://schemas.openxmlformats.org/drawingml/2006/picture">
+                  <pic:nvPicPr>
+                    <pic:cNvPr id="263861726" name="Picture 1"/>
+                    <pic:cNvPicPr>
+                      <a:picLocks noChangeAspect="1"/>
+                    </pic:cNvPicPr>
+                  </pic:nvPicPr>
+                  <pic:blipFill>
+                    <a:blip r:embed="rId7" cstate="print">
+                      <a:extLst>
+                        <a:ext uri="{28A0092B-C50C-407E-A947-70E740481C1C}">
+                          <a14:useLocalDpi xmlns:a14="http://schemas.microsoft.com/office/drawing/2010/main" val="0"/>
+                        </a:ext>
+                      </a:extLst>
+                    </a:blip>
+                    <a:srcRect/>
+                    <a:stretch>
+                      <a:fillRect/>
+                    </a:stretch>
+                  </pic:blipFill>
+                  <pic:spPr bwMode="auto">
+                    <a:xfrm>
+                      <a:off x="0" y="0"/>
+                      <a:ext cx="1303020" cy="730250"/>
+                    </a:xfrm>
+                    <a:prstGeom prst="rect">
+                      <a:avLst/>
+                    </a:prstGeom>
+                    <a:noFill/>
+                    <a:ln>
+                      <a:noFill/>
+                    </a:ln>
+                  </pic:spPr>
+                </pic:pic>
+              </a:graphicData>
+            </a:graphic>
+          </wp:anchor>
+        </w:drawing>
+      </w:r>
+      <w:proofErr w:type="gramStart"/>
       <w:r>
         <w:rPr>
           <w:rFonts w:ascii="Cambria" w:eastAsia="Cambria" w:hAnsi="Cambria" w:cs="Cambria"/>
@@ -4560,40 +4812,105 @@
           <w:sz w:val="20"/>
           <w:szCs w:val="20"/>
         </w:rPr>
-        <w:t>961004-01-5879</w:t>
-      </w:r>
+        <w:t>{{</w:t>
+      </w:r>
+      <w:proofErr w:type="gramEnd"/>
+      <w:r>
+        <w:rPr>
+          <w:rFonts w:ascii="Cambria" w:eastAsia="Cambria" w:hAnsi="Cambria" w:cs="Cambria"/>
+          <w:b/>
+          <w:spacing w:val="-10"/>
+          <w:sz w:val="20"/>
+          <w:szCs w:val="20"/>
+        </w:rPr>
+        <w:t>tenant_id}}</w:t>
+      </w:r>
+      <w:bookmarkEnd w:id="1"/>
     </w:p>
     <w:sectPr>
-      <w:headerReference w:type="first" r:id="rIdNestHeader"/>
+      <w:headerReference w:type="first" r:id="rId8"/>
       <w:pgSz w:w="12240" w:h="15840"/>
       <w:pgMar w:top="1440" w:right="1800" w:bottom="1440" w:left="1800" w:header="1300" w:footer="720" w:gutter="0"/>
       <w:cols w:space="720"/>
+      <w:titlePg/>
       <w:docGrid w:linePitch="360"/>
-      <w:titlePg/>
     </w:sectPr>
   </w:body>
 </w:document>
 </file>
 
-<file path=word/nest-header.xml><?xml version="1.0" encoding="utf-8"?>
-<w:hdr xmlns:m="http://schemas.openxmlformats.org/officeDocument/2006/math" xmlns:mc="http://schemas.openxmlformats.org/markup-compatibility/2006" xmlns:mo="http://schemas.microsoft.com/office/mac/office/2008/main" xmlns:mv="urn:schemas-microsoft-com:mac:vml" xmlns:o="urn:schemas-microsoft-com:office:office" xmlns:r="http://schemas.openxmlformats.org/officeDocument/2006/relationships" xmlns:v="urn:schemas-microsoft-com:vml" xmlns:w10="urn:schemas-microsoft-com:office:word" xmlns:w14="http://schemas.microsoft.com/office/word/2010/wordml" xmlns:w="http://schemas.openxmlformats.org/wordprocessingml/2006/main" xmlns:wne="http://schemas.microsoft.com/office/word/2006/wordml" xmlns:wp14="http://schemas.microsoft.com/office/word/2010/wordprocessingDrawing" xmlns:wp="http://schemas.openxmlformats.org/drawingml/2006/wordprocessingDrawing" xmlns:wpc="http://schemas.microsoft.com/office/word/2010/wordprocessingCanvas" xmlns:wpg="http://schemas.microsoft.com/office/word/2010/wordprocessingGroup" xmlns:wpi="http://schemas.microsoft.com/office/word/2010/wordprocessingInk" xmlns:wps="http://schemas.microsoft.com/office/word/2010/wordprocessingShape" mc:Ignorable="w14 wp14">
+<file path=word/endnotes.xml><?xml version="1.0" encoding="utf-8"?>
+<w:endnotes xmlns:wpc="http://schemas.microsoft.com/office/word/2010/wordprocessingCanvas" xmlns:cx="http://schemas.microsoft.com/office/drawing/2014/chartex" xmlns:cx1="http://schemas.microsoft.com/office/drawing/2015/9/8/chartex" xmlns:cx2="http://schemas.microsoft.com/office/drawing/2015/10/21/chartex" xmlns:cx3="http://schemas.microsoft.com/office/drawing/2016/5/9/chartex" xmlns:cx4="http://schemas.microsoft.com/office/drawing/2016/5/10/chartex" xmlns:cx5="http://schemas.microsoft.com/office/drawing/2016/5/11/chartex" xmlns:cx6="http://schemas.microsoft.com/office/drawing/2016/5/12/chartex" xmlns:cx7="http://schemas.microsoft.com/office/drawing/2016/5/13/chartex" xmlns:cx8="http://schemas.microsoft.com/office/drawing/2016/5/14/chartex" xmlns:mc="http://schemas.openxmlformats.org/markup-compatibility/2006" xmlns:aink="http://schemas.microsoft.com/office/drawing/2016/ink" xmlns:am3d="http://schemas.microsoft.com/office/drawing/2017/model3d" xmlns:o="urn:schemas-microsoft-com:office:office" xmlns:oel="http://schemas.microsoft.com/office/2019/extlst" xmlns:r="http://schemas.openxmlformats.org/officeDocument/2006/relationships" xmlns:m="http://schemas.openxmlformats.org/officeDocument/2006/math" xmlns:v="urn:schemas-microsoft-com:vml" xmlns:wp14="http://schemas.microsoft.com/office/word/2010/wordprocessingDrawing" xmlns:wp="http://schemas.openxmlformats.org/drawingml/2006/wordprocessingDrawing" xmlns:w10="urn:schemas-microsoft-com:office:word" xmlns:w="http://schemas.openxmlformats.org/wordprocessingml/2006/main" xmlns:w14="http://schemas.microsoft.com/office/word/2010/wordml" xmlns:w15="http://schemas.microsoft.com/office/word/2012/wordml" xmlns:w16cex="http://schemas.microsoft.com/office/word/2018/wordml/cex" xmlns:w16cid="http://schemas.microsoft.com/office/word/2016/wordml/cid" xmlns:w16="http://schemas.microsoft.com/office/word/2018/wordml" xmlns:w16du="http://schemas.microsoft.com/office/word/2023/wordml/word16du" xmlns:w16sdtdh="http://schemas.microsoft.com/office/word/2020/wordml/sdtdatahash" xmlns:w16sdtfl="http://schemas.microsoft.com/office/word/2024/wordml/sdtformatlock" xmlns:w16se="http://schemas.microsoft.com/office/word/2015/wordml/symex" xmlns:wpg="http://schemas.microsoft.com/office/word/2010/wordprocessingGroup" xmlns:wpi="http://schemas.microsoft.com/office/word/2010/wordprocessingInk" xmlns:wne="http://schemas.microsoft.com/office/word/2006/wordml" xmlns:wps="http://schemas.microsoft.com/office/word/2010/wordprocessingShape" mc:Ignorable="w14 w15 w16se w16cid w16 w16cex w16sdtdh w16sdtfl w16du wp14">
+  <w:endnote w:type="separator" w:id="-1">
+    <w:p>
+      <w:pPr>
+        <w:spacing w:after="0" w:line="240" w:lineRule="auto"/>
+      </w:pPr>
+      <w:r>
+        <w:separator/>
+      </w:r>
+    </w:p>
+  </w:endnote>
+  <w:endnote w:type="continuationSeparator" w:id="0">
+    <w:p>
+      <w:pPr>
+        <w:spacing w:after="0" w:line="240" w:lineRule="auto"/>
+      </w:pPr>
+      <w:r>
+        <w:continuationSeparator/>
+      </w:r>
+    </w:p>
+  </w:endnote>
+</w:endnotes>
+</file>
+
+<file path=word/footnotes.xml><?xml version="1.0" encoding="utf-8"?>
+<w:footnotes xmlns:wpc="http://schemas.microsoft.com/office/word/2010/wordprocessingCanvas" xmlns:cx="http://schemas.microsoft.com/office/drawing/2014/chartex" xmlns:cx1="http://schemas.microsoft.com/office/drawing/2015/9/8/chartex" xmlns:cx2="http://schemas.microsoft.com/office/drawing/2015/10/21/chartex" xmlns:cx3="http://schemas.microsoft.com/office/drawing/2016/5/9/chartex" xmlns:cx4="http://schemas.microsoft.com/office/drawing/2016/5/10/chartex" xmlns:cx5="http://schemas.microsoft.com/office/drawing/2016/5/11/chartex" xmlns:cx6="http://schemas.microsoft.com/office/drawing/2016/5/12/chartex" xmlns:cx7="http://schemas.microsoft.com/office/drawing/2016/5/13/chartex" xmlns:cx8="http://schemas.microsoft.com/office/drawing/2016/5/14/chartex" xmlns:mc="http://schemas.openxmlformats.org/markup-compatibility/2006" xmlns:aink="http://schemas.microsoft.com/office/drawing/2016/ink" xmlns:am3d="http://schemas.microsoft.com/office/drawing/2017/model3d" xmlns:o="urn:schemas-microsoft-com:office:office" xmlns:oel="http://schemas.microsoft.com/office/2019/extlst" xmlns:r="http://schemas.openxmlformats.org/officeDocument/2006/relationships" xmlns:m="http://schemas.openxmlformats.org/officeDocument/2006/math" xmlns:v="urn:schemas-microsoft-com:vml" xmlns:wp14="http://schemas.microsoft.com/office/word/2010/wordprocessingDrawing" xmlns:wp="http://schemas.openxmlformats.org/drawingml/2006/wordprocessingDrawing" xmlns:w10="urn:schemas-microsoft-com:office:word" xmlns:w="http://schemas.openxmlformats.org/wordprocessingml/2006/main" xmlns:w14="http://schemas.microsoft.com/office/word/2010/wordml" xmlns:w15="http://schemas.microsoft.com/office/word/2012/wordml" xmlns:w16cex="http://schemas.microsoft.com/office/word/2018/wordml/cex" xmlns:w16cid="http://schemas.microsoft.com/office/word/2016/wordml/cid" xmlns:w16="http://schemas.microsoft.com/office/word/2018/wordml" xmlns:w16du="http://schemas.microsoft.com/office/word/2023/wordml/word16du" xmlns:w16sdtdh="http://schemas.microsoft.com/office/word/2020/wordml/sdtdatahash" xmlns:w16sdtfl="http://schemas.microsoft.com/office/word/2024/wordml/sdtformatlock" xmlns:w16se="http://schemas.microsoft.com/office/word/2015/wordml/symex" xmlns:wpg="http://schemas.microsoft.com/office/word/2010/wordprocessingGroup" xmlns:wpi="http://schemas.microsoft.com/office/word/2010/wordprocessingInk" xmlns:wne="http://schemas.microsoft.com/office/word/2006/wordml" xmlns:wps="http://schemas.microsoft.com/office/word/2010/wordprocessingShape" mc:Ignorable="w14 w15 w16se w16cid w16 w16cex w16sdtdh w16sdtfl w16du wp14">
+  <w:footnote w:type="separator" w:id="-1">
+    <w:p>
+      <w:pPr>
+        <w:spacing w:after="0" w:line="240" w:lineRule="auto"/>
+      </w:pPr>
+      <w:r>
+        <w:separator/>
+      </w:r>
+    </w:p>
+  </w:footnote>
+  <w:footnote w:type="continuationSeparator" w:id="0">
+    <w:p>
+      <w:pPr>
+        <w:spacing w:after="0" w:line="240" w:lineRule="auto"/>
+      </w:pPr>
+      <w:r>
+        <w:continuationSeparator/>
+      </w:r>
+    </w:p>
+  </w:footnote>
+</w:footnotes>
+</file>
+
+<file path=word/header1.xml><?xml version="1.0" encoding="utf-8"?>
+<w:hdr xmlns:wpc="http://schemas.microsoft.com/office/word/2010/wordprocessingCanvas" xmlns:cx="http://schemas.microsoft.com/office/drawing/2014/chartex" xmlns:cx1="http://schemas.microsoft.com/office/drawing/2015/9/8/chartex" xmlns:cx2="http://schemas.microsoft.com/office/drawing/2015/10/21/chartex" xmlns:cx3="http://schemas.microsoft.com/office/drawing/2016/5/9/chartex" xmlns:cx4="http://schemas.microsoft.com/office/drawing/2016/5/10/chartex" xmlns:cx5="http://schemas.microsoft.com/office/drawing/2016/5/11/chartex" xmlns:cx6="http://schemas.microsoft.com/office/drawing/2016/5/12/chartex" xmlns:cx7="http://schemas.microsoft.com/office/drawing/2016/5/13/chartex" xmlns:cx8="http://schemas.microsoft.com/office/drawing/2016/5/14/chartex" xmlns:mc="http://schemas.openxmlformats.org/markup-compatibility/2006" xmlns:aink="http://schemas.microsoft.com/office/drawing/2016/ink" xmlns:am3d="http://schemas.microsoft.com/office/drawing/2017/model3d" xmlns:o="urn:schemas-microsoft-com:office:office" xmlns:oel="http://schemas.microsoft.com/office/2019/extlst" xmlns:r="http://schemas.openxmlformats.org/officeDocument/2006/relationships" xmlns:m="http://schemas.openxmlformats.org/officeDocument/2006/math" xmlns:v="urn:schemas-microsoft-com:vml" xmlns:wp14="http://schemas.microsoft.com/office/word/2010/wordprocessingDrawing" xmlns:wp="http://schemas.openxmlformats.org/drawingml/2006/wordprocessingDrawing" xmlns:w10="urn:schemas-microsoft-com:office:word" xmlns:w="http://schemas.openxmlformats.org/wordprocessingml/2006/main" xmlns:w14="http://schemas.microsoft.com/office/word/2010/wordml" xmlns:w15="http://schemas.microsoft.com/office/word/2012/wordml" xmlns:w16cex="http://schemas.microsoft.com/office/word/2018/wordml/cex" xmlns:w16cid="http://schemas.microsoft.com/office/word/2016/wordml/cid" xmlns:w16="http://schemas.microsoft.com/office/word/2018/wordml" xmlns:w16du="http://schemas.microsoft.com/office/word/2023/wordml/word16du" xmlns:w16sdtdh="http://schemas.microsoft.com/office/word/2020/wordml/sdtdatahash" xmlns:w16sdtfl="http://schemas.microsoft.com/office/word/2024/wordml/sdtformatlock" xmlns:w16se="http://schemas.microsoft.com/office/word/2015/wordml/symex" xmlns:wpg="http://schemas.microsoft.com/office/word/2010/wordprocessingGroup" xmlns:wpi="http://schemas.microsoft.com/office/word/2010/wordprocessingInk" xmlns:wne="http://schemas.microsoft.com/office/word/2006/wordml" xmlns:wps="http://schemas.microsoft.com/office/word/2010/wordprocessingShape" mc:Ignorable="w14 w15 w16se w16cid w16 w16cex w16sdtdh w16sdtfl w16du wp14">
   <w:p>
     <w:pPr>
-      <w:pStyle w:val="Header"/>
       <w:spacing w:after="200"/>
       <w:jc w:val="center"/>
     </w:pPr>
     <w:r>
+      <w:rPr>
+        <w:noProof/>
+      </w:rPr>
       <w:drawing>
-        <wp:inline xmlns:a="http://schemas.openxmlformats.org/drawingml/2006/main" xmlns:pic="http://schemas.openxmlformats.org/drawingml/2006/picture">
+        <wp:inline distT="0" distB="0" distL="0" distR="0" wp14:anchorId="67FF2FA7" wp14:editId="43D41227">
           <wp:extent cx="889000" cy="762000"/>
+          <wp:effectExtent l="0" t="0" r="0" b="0"/>
           <wp:docPr id="1" name="Picture 1"/>
           <wp:cNvGraphicFramePr>
-            <a:graphicFrameLocks noChangeAspect="1"/>
+            <a:graphicFrameLocks xmlns:a="http://schemas.openxmlformats.org/drawingml/2006/main" noChangeAspect="1"/>
           </wp:cNvGraphicFramePr>
-          <a:graphic>
+          <a:graphic xmlns:a="http://schemas.openxmlformats.org/drawingml/2006/main">
             <a:graphicData uri="http://schemas.openxmlformats.org/drawingml/2006/picture">
-              <pic:pic>
+              <pic:pic xmlns:pic="http://schemas.openxmlformats.org/drawingml/2006/picture">
                 <pic:nvPicPr>
                   <pic:cNvPr id="0" name="business_card.jpg"/>
                   <pic:cNvPicPr/>
@@ -4610,7 +4927,9 @@
                     <a:off x="0" y="0"/>
                     <a:ext cx="889000" cy="762000"/>
                   </a:xfrm>
-                  <a:prstGeom prst="rect"/>
+                  <a:prstGeom prst="rect">
+                    <a:avLst/>
+                  </a:prstGeom>
                 </pic:spPr>
               </pic:pic>
             </a:graphicData>
@@ -4625,30 +4944,16 @@
       <w:jc w:val="center"/>
     </w:pPr>
     <w:bookmarkStart w:id="2" w:name="NestHeader_name"/>
+    <w:bookmarkStart w:id="3" w:name="NNF_3_8640_272_22_1_S"/>
     <w:r>
       <w:rPr>
         <w:rFonts w:ascii="Arial" w:hAnsi="Arial"/>
         <w:b/>
         <w:sz w:val="22"/>
       </w:rPr>
-      <w:t>NEST &amp; NOOK PROPERTY CARE</w:t>
+      <w:t>{{company.name}}</w:t>
     </w:r>
     <w:bookmarkEnd w:id="2"/>
-  </w:p>
-  <w:p>
-    <w:pPr>
-      <w:spacing w:after="40" w:line="240" w:lineRule="auto"/>
-      <w:jc w:val="center"/>
-    </w:pPr>
-    <w:bookmarkStart w:id="3" w:name="NestHeader_registration"/>
-    <w:r>
-      <w:rPr>
-        <w:rFonts w:ascii="Arial" w:hAnsi="Arial"/>
-        <w:b/>
-        <w:sz w:val="24"/>
-      </w:rPr>
-      <w:t>202603156166 (KT0615852-M)</w:t>
-    </w:r>
     <w:bookmarkEnd w:id="3"/>
   </w:p>
   <w:p>
@@ -4656,45 +4961,113 @@
       <w:spacing w:after="40" w:line="240" w:lineRule="auto"/>
       <w:jc w:val="center"/>
     </w:pPr>
-    <w:bookmarkStart w:id="4" w:name="NestHeader_address"/>
+    <w:bookmarkStart w:id="4" w:name="NestHeader_registration"/>
+    <w:bookmarkStart w:id="5" w:name="NNF_4_8640_294_24_1_S"/>
+    <w:r>
+      <w:rPr>
+        <w:rFonts w:ascii="Arial" w:hAnsi="Arial"/>
+        <w:b/>
+      </w:rPr>
+      <w:t>{{</w:t>
+    </w:r>
+    <w:proofErr w:type="gramStart"/>
+    <w:r>
+      <w:rPr>
+        <w:rFonts w:ascii="Arial" w:hAnsi="Arial"/>
+        <w:b/>
+      </w:rPr>
+      <w:t>company.registration</w:t>
+    </w:r>
+    <w:proofErr w:type="gramEnd"/>
+    <w:r>
+      <w:rPr>
+        <w:rFonts w:ascii="Arial" w:hAnsi="Arial"/>
+        <w:b/>
+      </w:rPr>
+      <w:t>}}</w:t>
+    </w:r>
+    <w:bookmarkEnd w:id="4"/>
+    <w:bookmarkEnd w:id="5"/>
+  </w:p>
+  <w:p>
+    <w:pPr>
+      <w:spacing w:after="40" w:line="240" w:lineRule="auto"/>
+      <w:jc w:val="center"/>
+    </w:pPr>
+    <w:bookmarkStart w:id="6" w:name="NestHeader_address"/>
+    <w:bookmarkStart w:id="7" w:name="NNF_5_8640_260_21_1_T"/>
     <w:r>
       <w:rPr>
         <w:rFonts w:ascii="Times New Roman" w:hAnsi="Times New Roman"/>
         <w:b/>
         <w:sz w:val="21"/>
       </w:rPr>
-      <w:t>#16-03, Trellis Residences, 80100, J.B, Johor.</w:t>
+      <w:t>{{</w:t>
     </w:r>
-    <w:bookmarkEnd w:id="4"/>
+    <w:proofErr w:type="gramStart"/>
+    <w:r>
+      <w:rPr>
+        <w:rFonts w:ascii="Times New Roman" w:hAnsi="Times New Roman"/>
+        <w:b/>
+        <w:sz w:val="21"/>
+      </w:rPr>
+      <w:t>company.address</w:t>
+    </w:r>
+    <w:proofErr w:type="gramEnd"/>
+    <w:r>
+      <w:rPr>
+        <w:rFonts w:ascii="Times New Roman" w:hAnsi="Times New Roman"/>
+        <w:b/>
+        <w:sz w:val="21"/>
+      </w:rPr>
+      <w:t>}}</w:t>
+    </w:r>
+    <w:bookmarkEnd w:id="6"/>
+    <w:bookmarkEnd w:id="7"/>
   </w:p>
   <w:p>
     <w:pPr>
       <w:spacing w:after="40" w:line="240" w:lineRule="auto"/>
       <w:jc w:val="center"/>
     </w:pPr>
-    <w:bookmarkStart w:id="5" w:name="NestHeader_phone"/>
+    <w:bookmarkStart w:id="8" w:name="NestHeader_phone"/>
+    <w:bookmarkStart w:id="9" w:name="NNF_6_8640_281_23_1_T"/>
     <w:r>
       <w:rPr>
         <w:rFonts w:ascii="Times New Roman" w:hAnsi="Times New Roman"/>
         <w:b/>
         <w:sz w:val="23"/>
       </w:rPr>
-      <w:t>TEL NO.: +60111-3380335</w:t>
+      <w:t>TEL NO</w:t>
     </w:r>
-    <w:bookmarkEnd w:id="5"/>
+    <w:proofErr w:type="gramStart"/>
+    <w:r>
+      <w:rPr>
+        <w:rFonts w:ascii="Times New Roman" w:hAnsi="Times New Roman"/>
+        <w:b/>
+        <w:sz w:val="23"/>
+      </w:rPr>
+      <w:t>.: {{company.phone</w:t>
+    </w:r>
+    <w:proofErr w:type="gramEnd"/>
+    <w:r>
+      <w:rPr>
+        <w:rFonts w:ascii="Times New Roman" w:hAnsi="Times New Roman"/>
+        <w:b/>
+        <w:sz w:val="23"/>
+      </w:rPr>
+      <w:t>}}</w:t>
+    </w:r>
+    <w:bookmarkEnd w:id="8"/>
+    <w:bookmarkEnd w:id="9"/>
   </w:p>
   <w:p>
     <w:pPr>
-      <w:spacing w:after="240" w:line="20" w:lineRule="exact"/>
       <w:pBdr>
         <w:bottom w:val="single" w:sz="4" w:space="1" w:color="000000"/>
       </w:pBdr>
+      <w:spacing w:after="240" w:line="20" w:lineRule="exact"/>
     </w:pPr>
-    <w:r>
-      <w:rPr>
-        <w:sz w:val="2"/>
-      </w:rPr>
-    </w:r>
   </w:p>
 </w:hdr>
 </file>

</xml_diff>